<commit_message>
update the test reports with latest details
</commit_message>
<xml_diff>
--- a/Evidence/Test Report for CacheView component with Live Components.docx
+++ b/Evidence/Test Report for CacheView component with Live Components.docx
@@ -363,15 +363,123 @@
                 <w:rPr>
                   <w:rStyle w:val="Hyperlink"/>
                 </w:rPr>
-                <w:t>Link</w:t>
+                <w:t>Alica</w:t>
               </w:r>
             </w:hyperlink>
           </w:p>
+          <w:p/>
+          <w:p>
+            <w:hyperlink r:id="rId7" w:history="1">
+              <w:r>
+                <w:rPr>
+                  <w:rStyle w:val="Hyperlink"/>
+                </w:rPr>
+                <w:t>Bob</w:t>
+              </w:r>
+            </w:hyperlink>
+          </w:p>
         </w:tc>
         <w:tc>
           <w:tcPr>
             <w:tcW w:w="2506" w:type="dxa"/>
           </w:tcPr>
+          <w:p>
+            <w:hyperlink r:id="rId8" w:history="1">
+              <w:r>
+                <w:rPr>
+                  <w:rStyle w:val="Hyperlink"/>
+                </w:rPr>
+                <w:t>Alica-Cold-warm</w:t>
+              </w:r>
+            </w:hyperlink>
+          </w:p>
+          <w:p/>
+          <w:p>
+            <w:hyperlink r:id="rId9" w:history="1">
+              <w:r>
+                <w:rPr>
+                  <w:rStyle w:val="Hyperlink"/>
+                </w:rPr>
+                <w:t>Bob-Cold-warm</w:t>
+              </w:r>
+            </w:hyperlink>
+          </w:p>
+          <w:p/>
+          <w:p/>
+        </w:tc>
+      </w:tr>
+      <w:tr>
+        <w:tc>
+          <w:tcPr>
+            <w:tcW w:w="2518" w:type="dxa"/>
+          </w:tcPr>
+          <w:p>
+            <w:r>
+              <w:t>All five elements appear in the same order and position on a warm load as on a cold one.</w:t>
+            </w:r>
+          </w:p>
+        </w:tc>
+        <w:tc>
+          <w:tcPr>
+            <w:tcW w:w="2293" w:type="dxa"/>
+          </w:tcPr>
+          <w:p>
+            <w:r>
+              <w:t>Pass</w:t>
+            </w:r>
+          </w:p>
+        </w:tc>
+        <w:tc>
+          <w:tcPr>
+            <w:tcW w:w="2033" w:type="dxa"/>
+          </w:tcPr>
+          <w:p>
+            <w:hyperlink r:id="rId10" w:history="1">
+              <w:r>
+                <w:rPr>
+                  <w:rStyle w:val="Hyperlink"/>
+                </w:rPr>
+                <w:t>Alica</w:t>
+              </w:r>
+            </w:hyperlink>
+          </w:p>
+          <w:p/>
+          <w:p>
+            <w:hyperlink r:id="rId11" w:history="1">
+              <w:r>
+                <w:rPr>
+                  <w:rStyle w:val="Hyperlink"/>
+                </w:rPr>
+                <w:t>Bob</w:t>
+              </w:r>
+            </w:hyperlink>
+          </w:p>
+        </w:tc>
+        <w:tc>
+          <w:tcPr>
+            <w:tcW w:w="2506" w:type="dxa"/>
+          </w:tcPr>
+          <w:p>
+            <w:hyperlink r:id="rId12" w:history="1">
+              <w:r>
+                <w:rPr>
+                  <w:rStyle w:val="Hyperlink"/>
+                </w:rPr>
+                <w:t>Alica-Cold-warm</w:t>
+              </w:r>
+            </w:hyperlink>
+          </w:p>
+          <w:p/>
+          <w:p>
+            <w:hyperlink r:id="rId13" w:history="1">
+              <w:r>
+                <w:rPr>
+                  <w:rStyle w:val="Hyperlink"/>
+                </w:rPr>
+                <w:t>Bob-Cold-warm</w:t>
+              </w:r>
+            </w:hyperlink>
+          </w:p>
           <w:p>
             <w:pPr>
               <w:rPr>
@@ -379,13 +487,6 @@
                 <w:bCs/>
               </w:rPr>
             </w:pPr>
-            <w:r>
-              <w:rPr>
-                <w:b/>
-                <w:bCs/>
-              </w:rPr>
-              <w:t>-</w:t>
-            </w:r>
           </w:p>
         </w:tc>
       </w:tr>
@@ -396,7 +497,7 @@
           </w:tcPr>
           <w:p>
             <w:r>
-              <w:t>All five elements appear in the same order and position on a warm load as on a cold one.</w:t>
+              <w:t>The two copies of the same live component keep their own captions on a warm load and are not swapped.</w:t>
             </w:r>
           </w:p>
         </w:tc>
@@ -415,20 +516,52 @@
             <w:tcW w:w="2033" w:type="dxa"/>
           </w:tcPr>
           <w:p>
-            <w:hyperlink r:id="rId7" w:history="1">
+            <w:hyperlink r:id="rId14" w:history="1">
               <w:r>
                 <w:rPr>
                   <w:rStyle w:val="Hyperlink"/>
                 </w:rPr>
-                <w:t>Link</w:t>
+                <w:t>Alica</w:t>
               </w:r>
             </w:hyperlink>
           </w:p>
+          <w:p/>
+          <w:p>
+            <w:hyperlink r:id="rId15" w:history="1">
+              <w:r>
+                <w:rPr>
+                  <w:rStyle w:val="Hyperlink"/>
+                </w:rPr>
+                <w:t>Bob</w:t>
+              </w:r>
+            </w:hyperlink>
+          </w:p>
         </w:tc>
         <w:tc>
           <w:tcPr>
             <w:tcW w:w="2506" w:type="dxa"/>
           </w:tcPr>
+          <w:p>
+            <w:hyperlink r:id="rId16" w:history="1">
+              <w:r>
+                <w:rPr>
+                  <w:rStyle w:val="Hyperlink"/>
+                </w:rPr>
+                <w:t>Alica-Cold-warm</w:t>
+              </w:r>
+            </w:hyperlink>
+          </w:p>
+          <w:p/>
+          <w:p>
+            <w:hyperlink r:id="rId17" w:history="1">
+              <w:r>
+                <w:rPr>
+                  <w:rStyle w:val="Hyperlink"/>
+                </w:rPr>
+                <w:t>Bob-Cold-warm</w:t>
+              </w:r>
+            </w:hyperlink>
+          </w:p>
           <w:p>
             <w:pPr>
               <w:rPr>
@@ -436,70 +569,6 @@
                 <w:bCs/>
               </w:rPr>
             </w:pPr>
-            <w:r>
-              <w:rPr>
-                <w:b/>
-                <w:bCs/>
-              </w:rPr>
-              <w:t>-</w:t>
-            </w:r>
-          </w:p>
-        </w:tc>
-      </w:tr>
-      <w:tr>
-        <w:tc>
-          <w:tcPr>
-            <w:tcW w:w="2518" w:type="dxa"/>
-          </w:tcPr>
-          <w:p>
-            <w:r>
-              <w:t>The two copies of the same live component keep their own captions on a warm load and are not swapped.</w:t>
-            </w:r>
-          </w:p>
-        </w:tc>
-        <w:tc>
-          <w:tcPr>
-            <w:tcW w:w="2293" w:type="dxa"/>
-          </w:tcPr>
-          <w:p>
-            <w:r>
-              <w:t>Pass</w:t>
-            </w:r>
-          </w:p>
-        </w:tc>
-        <w:tc>
-          <w:tcPr>
-            <w:tcW w:w="2033" w:type="dxa"/>
-          </w:tcPr>
-          <w:p>
-            <w:hyperlink r:id="rId8" w:history="1">
-              <w:r>
-                <w:rPr>
-                  <w:rStyle w:val="Hyperlink"/>
-                </w:rPr>
-                <w:t>Link</w:t>
-              </w:r>
-            </w:hyperlink>
-          </w:p>
-        </w:tc>
-        <w:tc>
-          <w:tcPr>
-            <w:tcW w:w="2506" w:type="dxa"/>
-          </w:tcPr>
-          <w:p>
-            <w:pPr>
-              <w:rPr>
-                <w:b/>
-                <w:bCs/>
-              </w:rPr>
-            </w:pPr>
-            <w:r>
-              <w:rPr>
-                <w:b/>
-                <w:bCs/>
-              </w:rPr>
-              <w:t>-</w:t>
-            </w:r>
           </w:p>
         </w:tc>
       </w:tr>
@@ -534,20 +603,52 @@
             <w:tcW w:w="2033" w:type="dxa"/>
           </w:tcPr>
           <w:p>
-            <w:hyperlink r:id="rId9" w:history="1">
+            <w:hyperlink r:id="rId18" w:history="1">
               <w:r>
                 <w:rPr>
                   <w:rStyle w:val="Hyperlink"/>
                 </w:rPr>
-                <w:t>Link</w:t>
+                <w:t>Alica</w:t>
               </w:r>
             </w:hyperlink>
           </w:p>
+          <w:p/>
+          <w:p>
+            <w:hyperlink r:id="rId19" w:history="1">
+              <w:r>
+                <w:rPr>
+                  <w:rStyle w:val="Hyperlink"/>
+                </w:rPr>
+                <w:t>Bob</w:t>
+              </w:r>
+            </w:hyperlink>
+          </w:p>
         </w:tc>
         <w:tc>
           <w:tcPr>
             <w:tcW w:w="2506" w:type="dxa"/>
           </w:tcPr>
+          <w:p>
+            <w:hyperlink r:id="rId20" w:history="1">
+              <w:r>
+                <w:rPr>
+                  <w:rStyle w:val="Hyperlink"/>
+                </w:rPr>
+                <w:t>Alica-Cold-warm</w:t>
+              </w:r>
+            </w:hyperlink>
+          </w:p>
+          <w:p/>
+          <w:p>
+            <w:hyperlink r:id="rId21" w:history="1">
+              <w:r>
+                <w:rPr>
+                  <w:rStyle w:val="Hyperlink"/>
+                </w:rPr>
+                <w:t>Bob-Cold-warm</w:t>
+              </w:r>
+            </w:hyperlink>
+          </w:p>
           <w:p>
             <w:pPr>
               <w:rPr>
@@ -555,13 +656,6 @@
                 <w:bCs/>
               </w:rPr>
             </w:pPr>
-            <w:r>
-              <w:rPr>
-                <w:b/>
-                <w:bCs/>
-              </w:rPr>
-              <w:t>-</w:t>
-            </w:r>
           </w:p>
         </w:tc>
       </w:tr>
@@ -591,20 +685,52 @@
             <w:tcW w:w="2033" w:type="dxa"/>
           </w:tcPr>
           <w:p>
-            <w:hyperlink r:id="rId10" w:history="1">
+            <w:hyperlink r:id="rId22" w:history="1">
               <w:r>
                 <w:rPr>
                   <w:rStyle w:val="Hyperlink"/>
                 </w:rPr>
-                <w:t>Link</w:t>
+                <w:t>Alica</w:t>
               </w:r>
             </w:hyperlink>
           </w:p>
+          <w:p/>
+          <w:p>
+            <w:hyperlink r:id="rId23" w:history="1">
+              <w:r>
+                <w:rPr>
+                  <w:rStyle w:val="Hyperlink"/>
+                </w:rPr>
+                <w:t>Bob</w:t>
+              </w:r>
+            </w:hyperlink>
+          </w:p>
         </w:tc>
         <w:tc>
           <w:tcPr>
             <w:tcW w:w="2506" w:type="dxa"/>
           </w:tcPr>
+          <w:p>
+            <w:hyperlink r:id="rId24" w:history="1">
+              <w:r>
+                <w:rPr>
+                  <w:rStyle w:val="Hyperlink"/>
+                </w:rPr>
+                <w:t>Alica-Cold-warm</w:t>
+              </w:r>
+            </w:hyperlink>
+          </w:p>
+          <w:p/>
+          <w:p>
+            <w:hyperlink r:id="rId25" w:history="1">
+              <w:r>
+                <w:rPr>
+                  <w:rStyle w:val="Hyperlink"/>
+                </w:rPr>
+                <w:t>Bob-Cold-warm</w:t>
+              </w:r>
+            </w:hyperlink>
+          </w:p>
           <w:p>
             <w:pPr>
               <w:rPr>
@@ -612,13 +738,6 @@
                 <w:bCs/>
               </w:rPr>
             </w:pPr>
-            <w:r>
-              <w:rPr>
-                <w:b/>
-                <w:bCs/>
-              </w:rPr>
-              <w:t>-</w:t>
-            </w:r>
           </w:p>
         </w:tc>
       </w:tr>

</xml_diff>